<commit_message>
Update SERDOCENTE profile with production bundle URLs
Replaces placeholder paths with real CDN URLs for CSS and JS bundles.
Adds encapsulation-class field (used as extra class on <main>) so the
profile's styles are correctly scoped to the 'ser-docente-2025-1' context.
Updates examples/aula.docx to match.

Co-Authored-By: Claude Sonnet 4.6 (1M context) <noreply@anthropic.com>
</commit_message>
<xml_diff>
--- a/examples/aula.docx
+++ b/examples/aula.docx
@@ -31,7 +31,28 @@
         <w:rPr>
           <w:rtl w:val="0"/>
         </w:rPr>
-        <w:t xml:space="preserve">&lt;atencao&gt;texto&lt;/atencao&gt;</w:t>
+        <w:t xml:space="preserve">meu texto aqui</w:t>
+      </w:r>
+    </w:p>
+    <w:p>
+      <w:pPr>
+        <w:rPr/>
+      </w:pPr>
+      <w:r>
+        <w:rPr>
+          <w:rtl w:val="0"/>
+        </w:rPr>
+      </w:r>
+    </w:p>
+    <w:p>
+      <w:pPr>
+        <w:rPr/>
+      </w:pPr>
+      <w:r>
+        <w:rPr>
+          <w:rtl w:val="0"/>
+        </w:rPr>
+        <w:t xml:space="preserve">&lt;atencao&gt;texto&lt;/atenção&gt;</w:t>
       </w:r>
     </w:p>
     <w:p>
@@ -150,17 +171,6 @@
         <w:rPr>
           <w:rtl w:val="0"/>
         </w:rPr>
-        <w:t xml:space="preserve">  &lt;/sanfonasecao&gt;</w:t>
-      </w:r>
-    </w:p>
-    <w:p>
-      <w:pPr>
-        <w:rPr/>
-      </w:pPr>
-      <w:r>
-        <w:rPr>
-          <w:rtl w:val="0"/>
-        </w:rPr>
         <w:t xml:space="preserve">&lt;/sanfona&gt;</w:t>
       </w:r>
     </w:p>
@@ -215,7 +225,7 @@
         <w:rPr>
           <w:rtl w:val="0"/>
         </w:rPr>
-        <w:t xml:space="preserve">    &lt;flipcardback&gt;verso&lt;/flipcardback&gt;</w:t>
+        <w:t xml:space="preserve">    &lt;flipcardback&gt;verso&lt;/flipcardbacck&gt;</w:t>
       </w:r>
     </w:p>
     <w:p>

</xml_diff>

<commit_message>
Replace <main> with <div> as content wrapper in build_html_page
Allows the encapsulation-class to be applied without semantic
constraints of <main>, which should be unique per page.

Co-Authored-By: Claude Sonnet 4.6 (1M context) <noreply@anthropic.com>
</commit_message>
<xml_diff>
--- a/examples/aula.docx
+++ b/examples/aula.docx
@@ -10,224 +10,149 @@
         <w:rPr>
           <w:rtl w:val="0"/>
         </w:rPr>
-        <w:t xml:space="preserve">&lt;citacao&gt;texto&lt;/citacao&gt;</w:t>
-      </w:r>
-    </w:p>
-    <w:p>
-      <w:pPr>
-        <w:rPr/>
-      </w:pPr>
-      <w:r>
-        <w:rPr>
-          <w:rtl w:val="0"/>
-        </w:rPr>
-      </w:r>
-    </w:p>
-    <w:p>
-      <w:pPr>
-        <w:rPr>
-          <w:i w:val="1"/>
-          <w:iCs w:val="1"/>
-        </w:rPr>
-      </w:pPr>
-      <w:r>
-        <w:rPr>
-          <w:rtl w:val="0"/>
-        </w:rPr>
-        <w:t xml:space="preserve">meu </w:t>
-      </w:r>
-      <w:r>
-        <w:rPr>
-          <w:b w:val="1"/>
-          <w:bCs w:val="1"/>
-          <w:rtl w:val="0"/>
-        </w:rPr>
-        <w:t xml:space="preserve">texto</w:t>
-      </w:r>
-      <w:r>
-        <w:rPr>
-          <w:rtl w:val="0"/>
-        </w:rPr>
-        <w:t xml:space="preserve"> </w:t>
-      </w:r>
-      <w:r>
-        <w:rPr>
-          <w:i w:val="1"/>
-          <w:iCs w:val="1"/>
-          <w:rtl w:val="0"/>
-        </w:rPr>
-        <w:t xml:space="preserve">aqui</w:t>
-      </w:r>
-    </w:p>
-    <w:p>
-      <w:pPr>
-        <w:rPr/>
-      </w:pPr>
-      <w:r>
-        <w:rPr>
-          <w:rtl w:val="0"/>
-        </w:rPr>
-      </w:r>
-    </w:p>
-    <w:p>
-      <w:pPr>
-        <w:rPr/>
-      </w:pPr>
-      <w:r>
-        <w:rPr>
-          <w:rtl w:val="0"/>
-        </w:rPr>
-        <w:t xml:space="preserve">&lt;atencao&gt;texto&lt;/atenç&gt;</w:t>
-      </w:r>
-    </w:p>
-    <w:p>
-      <w:pPr>
-        <w:rPr/>
-      </w:pPr>
-      <w:r>
-        <w:rPr>
-          <w:rtl w:val="0"/>
-        </w:rPr>
-      </w:r>
-    </w:p>
-    <w:p>
-      <w:pPr>
-        <w:rPr/>
-      </w:pPr>
-      <w:r>
-        <w:rPr>
-          <w:rtl w:val="0"/>
-        </w:rPr>
-        <w:t xml:space="preserve">&lt;carrossel&gt;</w:t>
-      </w:r>
-    </w:p>
-    <w:p>
-      <w:pPr>
-        <w:rPr/>
-      </w:pPr>
-      <w:r>
-        <w:rPr>
-          <w:rtl w:val="0"/>
-        </w:rPr>
-        <w:t xml:space="preserve">  &lt;carrosselslide&gt;slide1&lt;/carrosselslide&gt;</w:t>
-      </w:r>
-    </w:p>
-    <w:p>
-      <w:pPr>
-        <w:rPr/>
-      </w:pPr>
-      <w:r>
-        <w:rPr>
-          <w:rtl w:val="0"/>
-        </w:rPr>
-        <w:t xml:space="preserve">  &lt;carrosselslide&gt;slide2&lt;/carrosselslide&gt;</w:t>
-      </w:r>
-    </w:p>
-    <w:p>
-      <w:pPr>
-        <w:rPr/>
-      </w:pPr>
-      <w:r>
-        <w:rPr>
-          <w:rtl w:val="0"/>
-        </w:rPr>
-      </w:r>
-    </w:p>
-    <w:p>
-      <w:pPr>
-        <w:rPr/>
-      </w:pPr>
-      <w:r>
-        <w:rPr>
-          <w:rtl w:val="0"/>
-        </w:rPr>
-      </w:r>
-    </w:p>
-    <w:p>
-      <w:pPr>
-        <w:rPr/>
-      </w:pPr>
-      <w:r>
-        <w:rPr>
-          <w:rtl w:val="0"/>
-        </w:rPr>
-      </w:r>
-    </w:p>
-    <w:p>
-      <w:pPr>
-        <w:rPr/>
-      </w:pPr>
-      <w:r>
-        <w:rPr>
-          <w:rtl w:val="0"/>
-        </w:rPr>
-        <w:t xml:space="preserve">  &lt;sanfonasecao&gt;</w:t>
-      </w:r>
-    </w:p>
-    <w:p>
-      <w:pPr>
-        <w:rPr/>
-      </w:pPr>
-      <w:r>
-        <w:rPr>
-          <w:rtl w:val="0"/>
-        </w:rPr>
-        <w:t xml:space="preserve">    &lt;sanfonasecaocabecalho&gt;título sanfona 1&lt;/sanfonasecaocabecalho&gt;</w:t>
-      </w:r>
-    </w:p>
-    <w:p>
-      <w:pPr>
-        <w:rPr/>
-      </w:pPr>
-      <w:r>
-        <w:rPr>
-          <w:rtl w:val="0"/>
-        </w:rPr>
-        <w:t xml:space="preserve">    &lt;sanfonasecaocorpo&gt;conteúdo sanfona 1&lt;/sanfonasecaocorpo&gt;</w:t>
-      </w:r>
-    </w:p>
-    <w:p>
-      <w:pPr>
-        <w:rPr/>
-      </w:pPr>
-      <w:r>
-        <w:rPr>
-          <w:rtl w:val="0"/>
-        </w:rPr>
-        <w:t xml:space="preserve"> &lt;/sanfonasecao&gt;</w:t>
-      </w:r>
-    </w:p>
-    <w:p>
-      <w:pPr>
-        <w:rPr/>
-      </w:pPr>
-      <w:r>
-        <w:rPr>
-          <w:rtl w:val="0"/>
-        </w:rPr>
-        <w:t xml:space="preserve">  &lt;sanfonasecao&gt;</w:t>
-      </w:r>
-    </w:p>
-    <w:p>
-      <w:pPr>
-        <w:rPr/>
-      </w:pPr>
-      <w:r>
-        <w:rPr>
-          <w:rtl w:val="0"/>
-        </w:rPr>
-        <w:t xml:space="preserve">    &lt;sanfonasecaocabecalho&gt;título sanfona 2&lt;/sanfonasecaocabecalho&gt;</w:t>
-      </w:r>
-    </w:p>
-    <w:p>
-      <w:pPr>
-        <w:rPr/>
-      </w:pPr>
-      <w:r>
-        <w:rPr>
-          <w:rtl w:val="0"/>
-        </w:rPr>
-        <w:t xml:space="preserve">    &lt;sanfonasecaocorpo&gt;conteúdo sanfona 2&lt;/sanfonasecaocorpo&gt;</w:t>
+        <w:t xml:space="preserve">&lt;citacao&gt;texto&lt;/citasfcao&gt;</w:t>
+      </w:r>
+    </w:p>
+    <w:p>
+      <w:pPr>
+        <w:keepNext w:val="0"/>
+        <w:keepLines w:val="0"/>
+        <w:pageBreakBefore w:val="0"/>
+        <w:widowControl w:val="1"/>
+        <w:pBdr>
+          <w:top w:space="0" w:sz="0" w:val="nil"/>
+          <w:left w:space="0" w:sz="0" w:val="nil"/>
+          <w:bottom w:space="0" w:sz="0" w:val="nil"/>
+          <w:right w:space="0" w:sz="0" w:val="nil"/>
+          <w:between w:space="0" w:sz="0" w:val="nil"/>
+        </w:pBdr>
+        <w:shd w:fill="auto" w:val="clear"/>
+        <w:spacing w:after="0" w:before="0" w:line="276" w:lineRule="auto"/>
+        <w:ind w:left="0" w:right="0" w:firstLine="0"/>
+        <w:jc w:val="left"/>
+        <w:rPr/>
+      </w:pPr>
+      <w:r>
+        <w:rPr>
+          <w:rtl w:val="0"/>
+        </w:rPr>
+      </w:r>
+    </w:p>
+    <w:p>
+      <w:pPr>
+        <w:rPr/>
+      </w:pPr>
+      <w:r>
+        <w:rPr>
+          <w:rtl w:val="0"/>
+        </w:rPr>
+        <w:t xml:space="preserve">&lt;atencao&gt;texto&lt;/atensdfcao&gt;</w:t>
+      </w:r>
+    </w:p>
+    <w:p>
+      <w:pPr>
+        <w:rPr/>
+      </w:pPr>
+      <w:r>
+        <w:rPr>
+          <w:rtl w:val="0"/>
+        </w:rPr>
+      </w:r>
+    </w:p>
+    <w:p>
+      <w:pPr>
+        <w:rPr/>
+      </w:pPr>
+      <w:r>
+        <w:rPr>
+          <w:rtl w:val="0"/>
+        </w:rPr>
+      </w:r>
+    </w:p>
+    <w:p>
+      <w:pPr>
+        <w:rPr/>
+      </w:pPr>
+      <w:r>
+        <w:rPr>
+          <w:rtl w:val="0"/>
+        </w:rPr>
+        <w:t xml:space="preserve">  &lt;carrosselslide&gt;conteúdo&lt;/carrosselslide&gt;</w:t>
+      </w:r>
+    </w:p>
+    <w:p>
+      <w:pPr>
+        <w:rPr/>
+      </w:pPr>
+      <w:r>
+        <w:rPr>
+          <w:rtl w:val="0"/>
+        </w:rPr>
+        <w:t xml:space="preserve">  &lt;carrosselslide&gt;conteúdo&lt;/carrosselslide&gt;</w:t>
+      </w:r>
+    </w:p>
+    <w:p>
+      <w:pPr>
+        <w:rPr/>
+      </w:pPr>
+      <w:r>
+        <w:rPr>
+          <w:rtl w:val="0"/>
+        </w:rPr>
+        <w:t xml:space="preserve">&lt;/carrossel&gt;</w:t>
+      </w:r>
+    </w:p>
+    <w:p>
+      <w:pPr>
+        <w:rPr/>
+      </w:pPr>
+      <w:r>
+        <w:rPr>
+          <w:rtl w:val="0"/>
+        </w:rPr>
+      </w:r>
+    </w:p>
+    <w:p>
+      <w:pPr>
+        <w:rPr/>
+      </w:pPr>
+      <w:r>
+        <w:rPr>
+          <w:rtl w:val="0"/>
+        </w:rPr>
+      </w:r>
+    </w:p>
+    <w:p>
+      <w:pPr>
+        <w:rPr/>
+      </w:pPr>
+      <w:r>
+        <w:rPr>
+          <w:rtl w:val="0"/>
+        </w:rPr>
+        <w:t xml:space="preserve">    &lt;sanfonasecaocabecalho&gt;título&lt;/sanfonasecaocabecalho&gt;</w:t>
+      </w:r>
+    </w:p>
+    <w:p>
+      <w:pPr>
+        <w:rPr/>
+      </w:pPr>
+      <w:r>
+        <w:rPr>
+          <w:rtl w:val="0"/>
+        </w:rPr>
+        <w:t xml:space="preserve">    &lt;sanfonasecaocorpo&gt;conteúdo&lt;/sanfonasecaocorpo&gt;</w:t>
+      </w:r>
+    </w:p>
+    <w:p>
+      <w:pPr>
+        <w:rPr/>
+      </w:pPr>
+      <w:r>
+        <w:rPr>
+          <w:rtl w:val="0"/>
+        </w:rPr>
+        <w:t xml:space="preserve">  &lt;/sanfonasecao&gt;</w:t>
       </w:r>
     </w:p>
     <w:p>
@@ -259,17 +184,7 @@
         <w:rPr>
           <w:rtl w:val="0"/>
         </w:rPr>
-      </w:r>
-    </w:p>
-    <w:p>
-      <w:pPr>
-        <w:rPr/>
-      </w:pPr>
-      <w:r>
-        <w:rPr>
-          <w:rtl w:val="0"/>
-        </w:rPr>
-        <w:t xml:space="preserve">  &lt;flipcard&gt;</w:t>
+        <w:t xml:space="preserve">&lt;flipcards&gt;</w:t>
       </w:r>
     </w:p>
     <w:p>
@@ -291,7 +206,7 @@
         <w:rPr>
           <w:rtl w:val="0"/>
         </w:rPr>
-        <w:t xml:space="preserve">    &lt;flipcardback&gt;verso&lt;/flipcardbacck&gt;</w:t>
+        <w:t xml:space="preserve">    &lt;flipcardback&gt;verso&lt;/flipcardback&gt;</w:t>
       </w:r>
     </w:p>
     <w:p>

</xml_diff>

<commit_message>
Update README and example document
README: minor formatting fixes in troubleshooting section and adds
"Rodar LLM localmente" to the backlog.

Co-Authored-By: Claude Sonnet 4.6 (1M context) <noreply@anthropic.com>
</commit_message>
<xml_diff>
--- a/examples/aula.docx
+++ b/examples/aula.docx
@@ -46,27 +46,28 @@
         <w:rPr>
           <w:rtl w:val="0"/>
         </w:rPr>
-        <w:t xml:space="preserve">&lt;atencao&gt;texto&lt;/atensdfcao&gt;</w:t>
-      </w:r>
-    </w:p>
-    <w:p>
-      <w:pPr>
-        <w:rPr/>
-      </w:pPr>
-      <w:r>
-        <w:rPr>
-          <w:rtl w:val="0"/>
-        </w:rPr>
-      </w:r>
-    </w:p>
-    <w:p>
-      <w:pPr>
-        <w:rPr/>
-      </w:pPr>
-      <w:r>
-        <w:rPr>
-          <w:rtl w:val="0"/>
-        </w:rPr>
+        <w:t xml:space="preserve">&lt;atenção&gt;texto&lt;/atencao&gt;</w:t>
+      </w:r>
+    </w:p>
+    <w:p>
+      <w:pPr>
+        <w:rPr/>
+      </w:pPr>
+      <w:r>
+        <w:rPr>
+          <w:rtl w:val="0"/>
+        </w:rPr>
+      </w:r>
+    </w:p>
+    <w:p>
+      <w:pPr>
+        <w:rPr/>
+      </w:pPr>
+      <w:r>
+        <w:rPr>
+          <w:rtl w:val="0"/>
+        </w:rPr>
+        <w:t xml:space="preserve">&lt;carrossel&gt;</w:t>
       </w:r>
     </w:p>
     <w:p>

</xml_diff>